<commit_message>
Saved docker image screenshot to Word
</commit_message>
<xml_diff>
--- a/lab5/Link to Repository Lab 5.docx
+++ b/lab5/Link to Repository Lab 5.docx
@@ -35,15 +35,8 @@
               <w:t>Docker Mount Success</w:t>
             </w:r>
             <w:r>
-              <w:t xml:space="preserve"> – remembers </w:t>
-            </w:r>
-            <w:proofErr w:type="spellStart"/>
-            <w:proofErr w:type="gramStart"/>
-            <w:r>
-              <w:t>inventory.json</w:t>
-            </w:r>
-            <w:proofErr w:type="spellEnd"/>
-            <w:proofErr w:type="gramEnd"/>
+              <w:t xml:space="preserve"> – remembers inventory.json</w:t>
+            </w:r>
           </w:p>
         </w:tc>
         <w:tc>
@@ -224,13 +217,8 @@
               <w:t xml:space="preserve">Option </w:t>
             </w:r>
             <w:r>
-              <w:t xml:space="preserve">4 – with error </w:t>
-            </w:r>
-            <w:proofErr w:type="spellStart"/>
-            <w:r>
-              <w:t>checkings</w:t>
-            </w:r>
-            <w:proofErr w:type="spellEnd"/>
+              <w:t>4 – with error checkings</w:t>
+            </w:r>
           </w:p>
         </w:tc>
         <w:tc>
@@ -441,6 +429,63 @@
                           <a:xfrm>
                             <a:off x="0" y="0"/>
                             <a:ext cx="3203024" cy="2252692"/>
+                          </a:xfrm>
+                          <a:prstGeom prst="rect">
+                            <a:avLst/>
+                          </a:prstGeom>
+                        </pic:spPr>
+                      </pic:pic>
+                    </a:graphicData>
+                  </a:graphic>
+                </wp:inline>
+              </w:drawing>
+            </w:r>
+          </w:p>
+        </w:tc>
+      </w:tr>
+      <w:tr>
+        <w:tc>
+          <w:tcPr>
+            <w:tcW w:w="3782" w:type="dxa"/>
+          </w:tcPr>
+          <w:p>
+            <w:r>
+              <w:lastRenderedPageBreak/>
+              <w:t>Docker Image</w:t>
+            </w:r>
+          </w:p>
+        </w:tc>
+        <w:tc>
+          <w:tcPr>
+            <w:tcW w:w="5234" w:type="dxa"/>
+          </w:tcPr>
+          <w:p>
+            <w:r>
+              <w:drawing>
+                <wp:inline distT="0" distB="0" distL="0" distR="0" wp14:anchorId="482D722B" wp14:editId="6EFCD1DB">
+                  <wp:extent cx="3154680" cy="2281173"/>
+                  <wp:effectExtent l="0" t="0" r="7620" b="5080"/>
+                  <wp:docPr id="217083346" name="Picture 1"/>
+                  <wp:cNvGraphicFramePr>
+                    <a:graphicFrameLocks xmlns:a="http://schemas.openxmlformats.org/drawingml/2006/main" noChangeAspect="1"/>
+                  </wp:cNvGraphicFramePr>
+                  <a:graphic xmlns:a="http://schemas.openxmlformats.org/drawingml/2006/main">
+                    <a:graphicData uri="http://schemas.openxmlformats.org/drawingml/2006/picture">
+                      <pic:pic xmlns:pic="http://schemas.openxmlformats.org/drawingml/2006/picture">
+                        <pic:nvPicPr>
+                          <pic:cNvPr id="217083346" name=""/>
+                          <pic:cNvPicPr/>
+                        </pic:nvPicPr>
+                        <pic:blipFill>
+                          <a:blip r:embed="rId12"/>
+                          <a:stretch>
+                            <a:fillRect/>
+                          </a:stretch>
+                        </pic:blipFill>
+                        <pic:spPr>
+                          <a:xfrm>
+                            <a:off x="0" y="0"/>
+                            <a:ext cx="3172162" cy="2293814"/>
                           </a:xfrm>
                           <a:prstGeom prst="rect">
                             <a:avLst/>

</xml_diff>